<commit_message>
cv bits and more!
</commit_message>
<xml_diff>
--- a/downloads/cvs/DOCX/Arron Ware CV AV Broadcast Technician Mar26 .docx
+++ b/downloads/cvs/DOCX/Arron Ware CV AV Broadcast Technician Mar26 .docx
@@ -98,7 +98,7 @@
           <w:sz w:val="24"/>
           <w:szCs w:val="24"/>
         </w:rPr>
-        <w:t xml:space="preserve">keen to apply my skillset within the media sector. I have an extensive experience with production hardware and software from my time studying Music &amp; Sound Design at University. </w:t>
+        <w:t xml:space="preserve">keen to apply my skillset within the media sector. I have an extensive experience with production hardware and software from my time studying Music &amp; Sound Design at University. I have </w:t>
       </w:r>
       <w:r>
         <w:rPr>
@@ -107,7 +107,7 @@
           <w:sz w:val="24"/>
           <w:szCs w:val="24"/>
         </w:rPr>
-        <w:t>I have been working freelance with Vinco Sports and Manchester Basketball</w:t>
+        <w:t>continued my</w:t>
       </w:r>
       <w:r>
         <w:rPr>
@@ -116,7 +116,7 @@
           <w:sz w:val="24"/>
           <w:szCs w:val="24"/>
         </w:rPr>
-        <w:t xml:space="preserve">, where I enjoyed utilising my technical knowledge to aid </w:t>
+        <w:t xml:space="preserve"> freelance </w:t>
       </w:r>
       <w:r>
         <w:rPr>
@@ -125,7 +125,7 @@
           <w:sz w:val="24"/>
           <w:szCs w:val="24"/>
         </w:rPr>
-        <w:t xml:space="preserve">the </w:t>
+        <w:t xml:space="preserve">work </w:t>
       </w:r>
       <w:r>
         <w:rPr>
@@ -134,7 +134,34 @@
           <w:sz w:val="24"/>
           <w:szCs w:val="24"/>
         </w:rPr>
-        <w:t xml:space="preserve">productions whilst working alongside with a variety of people. </w:t>
+        <w:t xml:space="preserve">with Vinco Sports </w:t>
+      </w:r>
+      <w:r>
+        <w:rPr>
+          <w:b w:val="false"/>
+          <w:bCs w:val="false"/>
+          <w:sz w:val="24"/>
+          <w:szCs w:val="24"/>
+        </w:rPr>
+        <w:t xml:space="preserve">since leaving my role at ‘aps’ </w:t>
+      </w:r>
+      <w:r>
+        <w:rPr>
+          <w:b w:val="false"/>
+          <w:bCs w:val="false"/>
+          <w:sz w:val="24"/>
+          <w:szCs w:val="24"/>
+        </w:rPr>
+        <w:t xml:space="preserve">where I enjoyed utilising my technical knowledge to </w:t>
+      </w:r>
+      <w:r>
+        <w:rPr>
+          <w:b w:val="false"/>
+          <w:bCs w:val="false"/>
+          <w:sz w:val="24"/>
+          <w:szCs w:val="24"/>
+        </w:rPr>
+        <w:t>maintain and resolve any issues with equipment whilst also mastering the equipment rental process.</w:t>
       </w:r>
     </w:p>
     <w:p>
@@ -603,43 +630,21 @@
       </w:pPr>
       <w:r>
         <w:rPr/>
-        <w:t>0</w:t>
-      </w:r>
-      <w:r>
-        <w:rPr/>
-        <w:t>5</w:t>
-      </w:r>
-      <w:r>
-        <w:rPr/>
-        <w:t>/26–Present</w:t>
+        <w:t>05/26–Present</w:t>
       </w:r>
       <w:r>
         <w:rPr>
           <w:b/>
           <w:bCs/>
         </w:rPr>
-        <w:t xml:space="preserve"> </w:t>
+        <w:t xml:space="preserve"> Replay Operator – Vinco Sports </w:t>
       </w:r>
       <w:r>
         <w:rPr>
           <w:b/>
           <w:bCs/>
         </w:rPr>
-        <w:t>Replay Operator</w:t>
-      </w:r>
-      <w:r>
-        <w:rPr>
-          <w:b/>
-          <w:bCs/>
-        </w:rPr>
-        <w:t xml:space="preserve"> – </w:t>
-      </w:r>
-      <w:r>
-        <w:rPr>
-          <w:b/>
-          <w:bCs/>
-        </w:rPr>
-        <w:t>Vinco Sports</w:t>
+        <w:t>(Freelance)</w:t>
       </w:r>
     </w:p>
     <w:p>
@@ -673,14 +678,47 @@
       </w:pPr>
       <w:r>
         <w:rPr/>
-        <w:t>03/26–Present</w:t>
+        <w:t>0</w:t>
+      </w:r>
+      <w:r>
+        <w:rPr/>
+        <w:t>8</w:t>
+      </w:r>
+      <w:r>
+        <w:rPr/>
+        <w:t>/26–</w:t>
+      </w:r>
+      <w:r>
+        <w:rPr/>
+        <w:t>10/26</w:t>
       </w:r>
       <w:r>
         <w:rPr>
           <w:b/>
           <w:bCs/>
         </w:rPr>
-        <w:t xml:space="preserve"> Event Technician / Camera Operator – Manchester Basketball</w:t>
+        <w:t xml:space="preserve"> </w:t>
+      </w:r>
+      <w:r>
+        <w:rPr>
+          <w:b/>
+          <w:bCs/>
+        </w:rPr>
+        <w:t>Junior AV Technician</w:t>
+      </w:r>
+      <w:r>
+        <w:rPr>
+          <w:b/>
+          <w:bCs/>
+        </w:rPr>
+        <w:t xml:space="preserve"> – </w:t>
+      </w:r>
+      <w:r>
+        <w:rPr>
+          <w:b/>
+          <w:bCs/>
+        </w:rPr>
+        <w:t>aps Events &amp; Media</w:t>
       </w:r>
     </w:p>
     <w:p>
@@ -699,7 +737,7 @@
       </w:pPr>
       <w:r>
         <w:rPr/>
-        <w:t xml:space="preserve">Working alongside the crew to route cabling for audio &amp; cameras, rig lighting, configure the vision mixing equipment and operate the camera during the games. </w:t>
+        <w:t>Supporting the on-site teams by prepping their equipment for flying abroad, gaining experience with rental booking systems whilst also testing, maintaining and becoming deeply familiar with a range of equipment in a hands-on technical environment where I thrive. Experience programming flexible LED panel arrangements.</w:t>
       </w:r>
     </w:p>
     <w:p>
@@ -725,7 +763,7 @@
           <w:b/>
           <w:bCs/>
         </w:rPr>
-        <w:t xml:space="preserve"> Technical Operator (Internship) – Wavecast</w:t>
+        <w:t xml:space="preserve"> Event Technician / Camera Operator – Manchester Basketball</w:t>
       </w:r>
     </w:p>
     <w:p>
@@ -744,6 +782,47 @@
       </w:pPr>
       <w:r>
         <w:rPr/>
+        <w:t xml:space="preserve">Working alongside the crew to route cabling for audio &amp; cameras, rig lighting, configure the vision mixing equipment and operate the camera during the games. </w:t>
+      </w:r>
+    </w:p>
+    <w:p>
+      <w:pPr>
+        <w:pStyle w:val="Normal"/>
+        <w:spacing w:lineRule="auto" w:line="259" w:before="0" w:after="142"/>
+        <w:ind w:hanging="10" w:left="-5" w:right="0"/>
+        <w:rPr>
+          <w:b/>
+          <w:bCs/>
+        </w:rPr>
+      </w:pPr>
+      <w:r>
+        <w:rPr/>
+        <w:t>03/26–04/26</w:t>
+      </w:r>
+      <w:r>
+        <w:rPr>
+          <w:b/>
+          <w:bCs/>
+        </w:rPr>
+        <w:t xml:space="preserve"> Technical Operator (Internship) – Wavecast</w:t>
+      </w:r>
+    </w:p>
+    <w:p>
+      <w:pPr>
+        <w:pStyle w:val="Normal"/>
+        <w:numPr>
+          <w:ilvl w:val="0"/>
+          <w:numId w:val="2"/>
+        </w:numPr>
+        <w:suppressLineNumbers w:val="0"/>
+        <w:bidi w:val="0"/>
+        <w:spacing w:lineRule="auto" w:line="247" w:beforeAutospacing="0" w:before="0" w:afterAutospacing="0" w:after="266"/>
+        <w:ind w:hanging="360" w:left="705" w:right="0"/>
+        <w:jc w:val="left"/>
+        <w:rPr/>
+      </w:pPr>
+      <w:r>
+        <w:rPr/>
         <w:t>Remote vision mixing for clients based in the US &amp; UK, ensuring stable AV transmission and communicating with the client to ensure that they are happy throughout the broadcasting process, quickly resolving any technical difficulties during rehearsals beforehand.</w:t>
       </w:r>
     </w:p>
@@ -793,49 +872,6 @@
       <w:r>
         <w:rPr/>
         <w:t>Work experience with the AV Engineers at dock10 involved collaborating within an ongoing TV production set (1% Club &amp; Countdown). I ensured that equipment was functioning correctly (if not, we would conduct repairs). During my time here, we routed signals from studios to the correct control rooms whilst checking the health of signal paths to exterior junction boxes.</w:t>
-      </w:r>
-    </w:p>
-    <w:p>
-      <w:pPr>
-        <w:pStyle w:val="Normal"/>
-        <w:spacing w:lineRule="auto" w:line="259" w:before="0" w:after="142"/>
-        <w:ind w:hanging="10" w:left="-5" w:right="0"/>
-        <w:rPr/>
-      </w:pPr>
-      <w:r>
-        <w:rPr/>
-        <w:t>04/17</w:t>
-      </w:r>
-      <w:r>
-        <w:rPr>
-          <w:b/>
-          <w:bCs/>
-        </w:rPr>
-        <w:t xml:space="preserve"> Tech Support Intern - DFDS Seaways </w:t>
-      </w:r>
-    </w:p>
-    <w:p>
-      <w:pPr>
-        <w:pStyle w:val="Normal"/>
-        <w:numPr>
-          <w:ilvl w:val="0"/>
-          <w:numId w:val="2"/>
-        </w:numPr>
-        <w:spacing w:before="0" w:after="230"/>
-        <w:ind w:hanging="360" w:left="705" w:right="0"/>
-        <w:rPr/>
-      </w:pPr>
-      <w:r>
-        <w:rPr/>
-        <w:t>This internship focused primarily on technical support. As they were responsible for the entire ports upkeep, it required me to be on call with dispatch which has furthered my confidence in communicating with specialised vocabulary wh</w:t>
-      </w:r>
-      <w:r>
-        <w:rPr/>
-        <w:t>en</w:t>
-      </w:r>
-      <w:r>
-        <w:rPr/>
-        <w:t xml:space="preserve"> problem-solving.</w:t>
       </w:r>
     </w:p>
     <w:p>
@@ -950,16 +986,7 @@
           <w:kern w:val="0"/>
           <w14:ligatures w14:val="none"/>
         </w:rPr>
-        <w:t xml:space="preserve">I enjoy soldering/DIY electronics </w:t>
-      </w:r>
-      <w:r>
-        <w:rPr>
-          <w:rFonts w:eastAsia="Times New Roman"/>
-          <w:color w:val="auto"/>
-          <w:kern w:val="0"/>
-          <w14:ligatures w14:val="none"/>
-        </w:rPr>
-        <w:t xml:space="preserve">to </w:t>
+        <w:t xml:space="preserve">I enjoy soldering/DIY electronics to </w:t>
       </w:r>
     </w:p>
     <w:p>

</xml_diff>